<commit_message>
fix(report): add the missing pipeline diagram to the three newer cases
The tmp-smx, tetrazoles, and pyrazolylnucleosides report bundles never received
a copy of the pipeline diagram (fig0), so their Overview section rendered
"[figure not found: fig0_pipeline.png]". The diagram is case-agnostic — the
three existing copies are byte-identical — so copy the shared image into each
missing case's report/figures/pipeline/ and re-render the three reports; the
Overview now embeds the diagram.

Co-Authored-By: Claude Opus 4.8 <noreply@anthropic.com>
</commit_message>
<xml_diff>
--- a/cases/tetrazoles/report/report.docx
+++ b/cases/tetrazoles/report/report.docx
@@ -16,7 +16,7 @@
           <w:b w:val="0"/>
           <w:color w:val="718096"/>
         </w:rPr>
-        <w:t>Substrate: Cu(111)  |  Medium: 1 M HNO3  |  DFT level: B3LYP/6-311++G(d,p) (ddCOSMO:water)  |  Generated 2026-07-14 18:07</w:t>
+        <w:t>Substrate: Cu(111)  |  Medium: 1 M HNO3  |  DFT level: B3LYP/6-311++G(d,p) (ddCOSMO:water)  |  Generated 2026-07-14 18:15</w:t>
       </w:r>
     </w:p>
     <w:p>
@@ -37,6 +37,58 @@
       </w:pPr>
       <w:r>
         <w:t>1. Overview</w:t>
+      </w:r>
+    </w:p>
+    <w:p>
+      <w:pPr>
+        <w:jc w:val="center"/>
+      </w:pPr>
+      <w:r>
+        <w:drawing>
+          <wp:inline xmlns:a="http://schemas.openxmlformats.org/drawingml/2006/main" xmlns:pic="http://schemas.openxmlformats.org/drawingml/2006/picture">
+            <wp:extent cx="5212080" cy="5122037"/>
+            <wp:docPr id="1" name="Picture 1"/>
+            <wp:cNvGraphicFramePr>
+              <a:graphicFrameLocks noChangeAspect="1"/>
+            </wp:cNvGraphicFramePr>
+            <a:graphic>
+              <a:graphicData uri="http://schemas.openxmlformats.org/drawingml/2006/picture">
+                <pic:pic>
+                  <pic:nvPicPr>
+                    <pic:cNvPr id="0" name="fig0_pipeline.png"/>
+                    <pic:cNvPicPr/>
+                  </pic:nvPicPr>
+                  <pic:blipFill>
+                    <a:blip r:embed="rId9"/>
+                    <a:stretch>
+                      <a:fillRect/>
+                    </a:stretch>
+                  </pic:blipFill>
+                  <pic:spPr>
+                    <a:xfrm>
+                      <a:off x="0" y="0"/>
+                      <a:ext cx="5212080" cy="5122037"/>
+                    </a:xfrm>
+                    <a:prstGeom prst="rect"/>
+                  </pic:spPr>
+                </pic:pic>
+              </a:graphicData>
+            </a:graphic>
+          </wp:inline>
+        </w:drawing>
+      </w:r>
+    </w:p>
+    <w:p>
+      <w:pPr>
+        <w:jc w:val="center"/>
+      </w:pPr>
+      <w:r>
+        <w:rPr>
+          <w:i/>
+          <w:color w:val="718096"/>
+          <w:sz w:val="16"/>
+        </w:rPr>
+        <w:t>corrosim pipeline</w:t>
       </w:r>
     </w:p>
     <w:p>
@@ -837,7 +889,7 @@
         <w:drawing>
           <wp:inline xmlns:a="http://schemas.openxmlformats.org/drawingml/2006/main" xmlns:pic="http://schemas.openxmlformats.org/drawingml/2006/picture">
             <wp:extent cx="5212080" cy="2842953"/>
-            <wp:docPr id="1" name="Picture 1"/>
+            <wp:docPr id="2" name="Picture 2"/>
             <wp:cNvGraphicFramePr>
               <a:graphicFrameLocks noChangeAspect="1"/>
             </wp:cNvGraphicFramePr>
@@ -849,7 +901,7 @@
                     <pic:cNvPicPr/>
                   </pic:nvPicPr>
                   <pic:blipFill>
-                    <a:blip r:embed="rId9"/>
+                    <a:blip r:embed="rId10"/>
                     <a:stretch>
                       <a:fillRect/>
                     </a:stretch>
@@ -889,7 +941,7 @@
         <w:drawing>
           <wp:inline xmlns:a="http://schemas.openxmlformats.org/drawingml/2006/main" xmlns:pic="http://schemas.openxmlformats.org/drawingml/2006/picture">
             <wp:extent cx="5212080" cy="3235815"/>
-            <wp:docPr id="2" name="Picture 2"/>
+            <wp:docPr id="3" name="Picture 3"/>
             <wp:cNvGraphicFramePr>
               <a:graphicFrameLocks noChangeAspect="1"/>
             </wp:cNvGraphicFramePr>
@@ -901,7 +953,7 @@
                     <pic:cNvPicPr/>
                   </pic:nvPicPr>
                   <pic:blipFill>
-                    <a:blip r:embed="rId10"/>
+                    <a:blip r:embed="rId11"/>
                     <a:stretch>
                       <a:fillRect/>
                     </a:stretch>
@@ -949,7 +1001,7 @@
         <w:drawing>
           <wp:inline xmlns:a="http://schemas.openxmlformats.org/drawingml/2006/main" xmlns:pic="http://schemas.openxmlformats.org/drawingml/2006/picture">
             <wp:extent cx="2651760" cy="2810505"/>
-            <wp:docPr id="3" name="Picture 3"/>
+            <wp:docPr id="4" name="Picture 4"/>
             <wp:cNvGraphicFramePr>
               <a:graphicFrameLocks noChangeAspect="1"/>
             </wp:cNvGraphicFramePr>
@@ -961,7 +1013,7 @@
                     <pic:cNvPicPr/>
                   </pic:nvPicPr>
                   <pic:blipFill>
-                    <a:blip r:embed="rId11"/>
+                    <a:blip r:embed="rId12"/>
                     <a:stretch>
                       <a:fillRect/>
                     </a:stretch>
@@ -1001,7 +1053,7 @@
         <w:drawing>
           <wp:inline xmlns:a="http://schemas.openxmlformats.org/drawingml/2006/main" xmlns:pic="http://schemas.openxmlformats.org/drawingml/2006/picture">
             <wp:extent cx="2651760" cy="2810505"/>
-            <wp:docPr id="4" name="Picture 4"/>
+            <wp:docPr id="5" name="Picture 5"/>
             <wp:cNvGraphicFramePr>
               <a:graphicFrameLocks noChangeAspect="1"/>
             </wp:cNvGraphicFramePr>
@@ -1013,7 +1065,7 @@
                     <pic:cNvPicPr/>
                   </pic:nvPicPr>
                   <pic:blipFill>
-                    <a:blip r:embed="rId12"/>
+                    <a:blip r:embed="rId13"/>
                     <a:stretch>
                       <a:fillRect/>
                     </a:stretch>
@@ -1053,7 +1105,7 @@
         <w:drawing>
           <wp:inline xmlns:a="http://schemas.openxmlformats.org/drawingml/2006/main" xmlns:pic="http://schemas.openxmlformats.org/drawingml/2006/picture">
             <wp:extent cx="2651760" cy="2810505"/>
-            <wp:docPr id="5" name="Picture 5"/>
+            <wp:docPr id="6" name="Picture 6"/>
             <wp:cNvGraphicFramePr>
               <a:graphicFrameLocks noChangeAspect="1"/>
             </wp:cNvGraphicFramePr>
@@ -1065,7 +1117,7 @@
                     <pic:cNvPicPr/>
                   </pic:nvPicPr>
                   <pic:blipFill>
-                    <a:blip r:embed="rId13"/>
+                    <a:blip r:embed="rId14"/>
                     <a:stretch>
                       <a:fillRect/>
                     </a:stretch>
@@ -1105,7 +1157,7 @@
         <w:drawing>
           <wp:inline xmlns:a="http://schemas.openxmlformats.org/drawingml/2006/main" xmlns:pic="http://schemas.openxmlformats.org/drawingml/2006/picture">
             <wp:extent cx="2651760" cy="2810505"/>
-            <wp:docPr id="6" name="Picture 6"/>
+            <wp:docPr id="7" name="Picture 7"/>
             <wp:cNvGraphicFramePr>
               <a:graphicFrameLocks noChangeAspect="1"/>
             </wp:cNvGraphicFramePr>
@@ -1117,7 +1169,7 @@
                     <pic:cNvPicPr/>
                   </pic:nvPicPr>
                   <pic:blipFill>
-                    <a:blip r:embed="rId14"/>
+                    <a:blip r:embed="rId15"/>
                     <a:stretch>
                       <a:fillRect/>
                     </a:stretch>
@@ -1157,7 +1209,7 @@
         <w:drawing>
           <wp:inline xmlns:a="http://schemas.openxmlformats.org/drawingml/2006/main" xmlns:pic="http://schemas.openxmlformats.org/drawingml/2006/picture">
             <wp:extent cx="2651760" cy="2810505"/>
-            <wp:docPr id="7" name="Picture 7"/>
+            <wp:docPr id="8" name="Picture 8"/>
             <wp:cNvGraphicFramePr>
               <a:graphicFrameLocks noChangeAspect="1"/>
             </wp:cNvGraphicFramePr>
@@ -1169,7 +1221,7 @@
                     <pic:cNvPicPr/>
                   </pic:nvPicPr>
                   <pic:blipFill>
-                    <a:blip r:embed="rId15"/>
+                    <a:blip r:embed="rId16"/>
                     <a:stretch>
                       <a:fillRect/>
                     </a:stretch>
@@ -1209,7 +1261,7 @@
         <w:drawing>
           <wp:inline xmlns:a="http://schemas.openxmlformats.org/drawingml/2006/main" xmlns:pic="http://schemas.openxmlformats.org/drawingml/2006/picture">
             <wp:extent cx="2651760" cy="2810505"/>
-            <wp:docPr id="8" name="Picture 8"/>
+            <wp:docPr id="9" name="Picture 9"/>
             <wp:cNvGraphicFramePr>
               <a:graphicFrameLocks noChangeAspect="1"/>
             </wp:cNvGraphicFramePr>
@@ -1221,7 +1273,7 @@
                     <pic:cNvPicPr/>
                   </pic:nvPicPr>
                   <pic:blipFill>
-                    <a:blip r:embed="rId16"/>
+                    <a:blip r:embed="rId17"/>
                     <a:stretch>
                       <a:fillRect/>
                     </a:stretch>
@@ -1261,7 +1313,7 @@
         <w:drawing>
           <wp:inline xmlns:a="http://schemas.openxmlformats.org/drawingml/2006/main" xmlns:pic="http://schemas.openxmlformats.org/drawingml/2006/picture">
             <wp:extent cx="2651760" cy="2810505"/>
-            <wp:docPr id="9" name="Picture 9"/>
+            <wp:docPr id="10" name="Picture 10"/>
             <wp:cNvGraphicFramePr>
               <a:graphicFrameLocks noChangeAspect="1"/>
             </wp:cNvGraphicFramePr>
@@ -1273,7 +1325,7 @@
                     <pic:cNvPicPr/>
                   </pic:nvPicPr>
                   <pic:blipFill>
-                    <a:blip r:embed="rId17"/>
+                    <a:blip r:embed="rId18"/>
                     <a:stretch>
                       <a:fillRect/>
                     </a:stretch>
@@ -1313,7 +1365,7 @@
         <w:drawing>
           <wp:inline xmlns:a="http://schemas.openxmlformats.org/drawingml/2006/main" xmlns:pic="http://schemas.openxmlformats.org/drawingml/2006/picture">
             <wp:extent cx="2651760" cy="2810505"/>
-            <wp:docPr id="10" name="Picture 10"/>
+            <wp:docPr id="11" name="Picture 11"/>
             <wp:cNvGraphicFramePr>
               <a:graphicFrameLocks noChangeAspect="1"/>
             </wp:cNvGraphicFramePr>
@@ -1325,7 +1377,7 @@
                     <pic:cNvPicPr/>
                   </pic:nvPicPr>
                   <pic:blipFill>
-                    <a:blip r:embed="rId18"/>
+                    <a:blip r:embed="rId19"/>
                     <a:stretch>
                       <a:fillRect/>
                     </a:stretch>
@@ -1365,7 +1417,7 @@
         <w:drawing>
           <wp:inline xmlns:a="http://schemas.openxmlformats.org/drawingml/2006/main" xmlns:pic="http://schemas.openxmlformats.org/drawingml/2006/picture">
             <wp:extent cx="5212080" cy="1456481"/>
-            <wp:docPr id="11" name="Picture 11"/>
+            <wp:docPr id="12" name="Picture 12"/>
             <wp:cNvGraphicFramePr>
               <a:graphicFrameLocks noChangeAspect="1"/>
             </wp:cNvGraphicFramePr>
@@ -1377,7 +1429,7 @@
                     <pic:cNvPicPr/>
                   </pic:nvPicPr>
                   <pic:blipFill>
-                    <a:blip r:embed="rId19"/>
+                    <a:blip r:embed="rId20"/>
                     <a:stretch>
                       <a:fillRect/>
                     </a:stretch>
@@ -1417,7 +1469,7 @@
         <w:drawing>
           <wp:inline xmlns:a="http://schemas.openxmlformats.org/drawingml/2006/main" xmlns:pic="http://schemas.openxmlformats.org/drawingml/2006/picture">
             <wp:extent cx="5212080" cy="2100390"/>
-            <wp:docPr id="12" name="Picture 12"/>
+            <wp:docPr id="13" name="Picture 13"/>
             <wp:cNvGraphicFramePr>
               <a:graphicFrameLocks noChangeAspect="1"/>
             </wp:cNvGraphicFramePr>
@@ -1429,7 +1481,7 @@
                     <pic:cNvPicPr/>
                   </pic:nvPicPr>
                   <pic:blipFill>
-                    <a:blip r:embed="rId20"/>
+                    <a:blip r:embed="rId21"/>
                     <a:stretch>
                       <a:fillRect/>
                     </a:stretch>
@@ -4299,7 +4351,7 @@
         <w:drawing>
           <wp:inline xmlns:a="http://schemas.openxmlformats.org/drawingml/2006/main" xmlns:pic="http://schemas.openxmlformats.org/drawingml/2006/picture">
             <wp:extent cx="5212080" cy="2015906"/>
-            <wp:docPr id="13" name="Picture 13"/>
+            <wp:docPr id="14" name="Picture 14"/>
             <wp:cNvGraphicFramePr>
               <a:graphicFrameLocks noChangeAspect="1"/>
             </wp:cNvGraphicFramePr>
@@ -4311,7 +4363,7 @@
                     <pic:cNvPicPr/>
                   </pic:nvPicPr>
                   <pic:blipFill>
-                    <a:blip r:embed="rId21"/>
+                    <a:blip r:embed="rId22"/>
                     <a:stretch>
                       <a:fillRect/>
                     </a:stretch>
@@ -4351,7 +4403,7 @@
         <w:drawing>
           <wp:inline xmlns:a="http://schemas.openxmlformats.org/drawingml/2006/main" xmlns:pic="http://schemas.openxmlformats.org/drawingml/2006/picture">
             <wp:extent cx="5212080" cy="2015906"/>
-            <wp:docPr id="14" name="Picture 14"/>
+            <wp:docPr id="15" name="Picture 15"/>
             <wp:cNvGraphicFramePr>
               <a:graphicFrameLocks noChangeAspect="1"/>
             </wp:cNvGraphicFramePr>
@@ -4363,7 +4415,7 @@
                     <pic:cNvPicPr/>
                   </pic:nvPicPr>
                   <pic:blipFill>
-                    <a:blip r:embed="rId22"/>
+                    <a:blip r:embed="rId23"/>
                     <a:stretch>
                       <a:fillRect/>
                     </a:stretch>
@@ -4403,7 +4455,7 @@
         <w:drawing>
           <wp:inline xmlns:a="http://schemas.openxmlformats.org/drawingml/2006/main" xmlns:pic="http://schemas.openxmlformats.org/drawingml/2006/picture">
             <wp:extent cx="5212080" cy="2018957"/>
-            <wp:docPr id="15" name="Picture 15"/>
+            <wp:docPr id="16" name="Picture 16"/>
             <wp:cNvGraphicFramePr>
               <a:graphicFrameLocks noChangeAspect="1"/>
             </wp:cNvGraphicFramePr>
@@ -4415,7 +4467,7 @@
                     <pic:cNvPicPr/>
                   </pic:nvPicPr>
                   <pic:blipFill>
-                    <a:blip r:embed="rId23"/>
+                    <a:blip r:embed="rId24"/>
                     <a:stretch>
                       <a:fillRect/>
                     </a:stretch>
@@ -4455,7 +4507,7 @@
         <w:drawing>
           <wp:inline xmlns:a="http://schemas.openxmlformats.org/drawingml/2006/main" xmlns:pic="http://schemas.openxmlformats.org/drawingml/2006/picture">
             <wp:extent cx="5212080" cy="2015906"/>
-            <wp:docPr id="16" name="Picture 16"/>
+            <wp:docPr id="17" name="Picture 17"/>
             <wp:cNvGraphicFramePr>
               <a:graphicFrameLocks noChangeAspect="1"/>
             </wp:cNvGraphicFramePr>
@@ -4467,7 +4519,7 @@
                     <pic:cNvPicPr/>
                   </pic:nvPicPr>
                   <pic:blipFill>
-                    <a:blip r:embed="rId24"/>
+                    <a:blip r:embed="rId25"/>
                     <a:stretch>
                       <a:fillRect/>
                     </a:stretch>
@@ -4515,7 +4567,7 @@
         <w:drawing>
           <wp:inline xmlns:a="http://schemas.openxmlformats.org/drawingml/2006/main" xmlns:pic="http://schemas.openxmlformats.org/drawingml/2006/picture">
             <wp:extent cx="2651760" cy="2372627"/>
-            <wp:docPr id="17" name="Picture 17"/>
+            <wp:docPr id="18" name="Picture 18"/>
             <wp:cNvGraphicFramePr>
               <a:graphicFrameLocks noChangeAspect="1"/>
             </wp:cNvGraphicFramePr>
@@ -4527,7 +4579,7 @@
                     <pic:cNvPicPr/>
                   </pic:nvPicPr>
                   <pic:blipFill>
-                    <a:blip r:embed="rId25"/>
+                    <a:blip r:embed="rId26"/>
                     <a:stretch>
                       <a:fillRect/>
                     </a:stretch>
@@ -4567,7 +4619,7 @@
         <w:drawing>
           <wp:inline xmlns:a="http://schemas.openxmlformats.org/drawingml/2006/main" xmlns:pic="http://schemas.openxmlformats.org/drawingml/2006/picture">
             <wp:extent cx="2651760" cy="2372627"/>
-            <wp:docPr id="18" name="Picture 18"/>
+            <wp:docPr id="19" name="Picture 19"/>
             <wp:cNvGraphicFramePr>
               <a:graphicFrameLocks noChangeAspect="1"/>
             </wp:cNvGraphicFramePr>
@@ -4579,7 +4631,7 @@
                     <pic:cNvPicPr/>
                   </pic:nvPicPr>
                   <pic:blipFill>
-                    <a:blip r:embed="rId26"/>
+                    <a:blip r:embed="rId27"/>
                     <a:stretch>
                       <a:fillRect/>
                     </a:stretch>
@@ -4619,7 +4671,7 @@
         <w:drawing>
           <wp:inline xmlns:a="http://schemas.openxmlformats.org/drawingml/2006/main" xmlns:pic="http://schemas.openxmlformats.org/drawingml/2006/picture">
             <wp:extent cx="2651760" cy="2372627"/>
-            <wp:docPr id="19" name="Picture 19"/>
+            <wp:docPr id="20" name="Picture 20"/>
             <wp:cNvGraphicFramePr>
               <a:graphicFrameLocks noChangeAspect="1"/>
             </wp:cNvGraphicFramePr>
@@ -4631,7 +4683,7 @@
                     <pic:cNvPicPr/>
                   </pic:nvPicPr>
                   <pic:blipFill>
-                    <a:blip r:embed="rId27"/>
+                    <a:blip r:embed="rId28"/>
                     <a:stretch>
                       <a:fillRect/>
                     </a:stretch>
@@ -4671,7 +4723,7 @@
         <w:drawing>
           <wp:inline xmlns:a="http://schemas.openxmlformats.org/drawingml/2006/main" xmlns:pic="http://schemas.openxmlformats.org/drawingml/2006/picture">
             <wp:extent cx="2651760" cy="2389153"/>
-            <wp:docPr id="20" name="Picture 20"/>
+            <wp:docPr id="21" name="Picture 21"/>
             <wp:cNvGraphicFramePr>
               <a:graphicFrameLocks noChangeAspect="1"/>
             </wp:cNvGraphicFramePr>
@@ -4683,7 +4735,7 @@
                     <pic:cNvPicPr/>
                   </pic:nvPicPr>
                   <pic:blipFill>
-                    <a:blip r:embed="rId28"/>
+                    <a:blip r:embed="rId29"/>
                     <a:stretch>
                       <a:fillRect/>
                     </a:stretch>
@@ -4731,7 +4783,7 @@
         <w:drawing>
           <wp:inline xmlns:a="http://schemas.openxmlformats.org/drawingml/2006/main" xmlns:pic="http://schemas.openxmlformats.org/drawingml/2006/picture">
             <wp:extent cx="5212080" cy="3046873"/>
-            <wp:docPr id="21" name="Picture 21"/>
+            <wp:docPr id="22" name="Picture 22"/>
             <wp:cNvGraphicFramePr>
               <a:graphicFrameLocks noChangeAspect="1"/>
             </wp:cNvGraphicFramePr>
@@ -4743,7 +4795,7 @@
                     <pic:cNvPicPr/>
                   </pic:nvPicPr>
                   <pic:blipFill>
-                    <a:blip r:embed="rId29"/>
+                    <a:blip r:embed="rId30"/>
                     <a:stretch>
                       <a:fillRect/>
                     </a:stretch>
@@ -4783,7 +4835,7 @@
         <w:drawing>
           <wp:inline xmlns:a="http://schemas.openxmlformats.org/drawingml/2006/main" xmlns:pic="http://schemas.openxmlformats.org/drawingml/2006/picture">
             <wp:extent cx="5212080" cy="3046873"/>
-            <wp:docPr id="22" name="Picture 22"/>
+            <wp:docPr id="23" name="Picture 23"/>
             <wp:cNvGraphicFramePr>
               <a:graphicFrameLocks noChangeAspect="1"/>
             </wp:cNvGraphicFramePr>
@@ -4795,7 +4847,7 @@
                     <pic:cNvPicPr/>
                   </pic:nvPicPr>
                   <pic:blipFill>
-                    <a:blip r:embed="rId30"/>
+                    <a:blip r:embed="rId31"/>
                     <a:stretch>
                       <a:fillRect/>
                     </a:stretch>
@@ -4835,7 +4887,7 @@
         <w:drawing>
           <wp:inline xmlns:a="http://schemas.openxmlformats.org/drawingml/2006/main" xmlns:pic="http://schemas.openxmlformats.org/drawingml/2006/picture">
             <wp:extent cx="5212080" cy="3046873"/>
-            <wp:docPr id="23" name="Picture 23"/>
+            <wp:docPr id="24" name="Picture 24"/>
             <wp:cNvGraphicFramePr>
               <a:graphicFrameLocks noChangeAspect="1"/>
             </wp:cNvGraphicFramePr>
@@ -4847,7 +4899,7 @@
                     <pic:cNvPicPr/>
                   </pic:nvPicPr>
                   <pic:blipFill>
-                    <a:blip r:embed="rId31"/>
+                    <a:blip r:embed="rId32"/>
                     <a:stretch>
                       <a:fillRect/>
                     </a:stretch>
@@ -4887,7 +4939,7 @@
         <w:drawing>
           <wp:inline xmlns:a="http://schemas.openxmlformats.org/drawingml/2006/main" xmlns:pic="http://schemas.openxmlformats.org/drawingml/2006/picture">
             <wp:extent cx="5212080" cy="3046873"/>
-            <wp:docPr id="24" name="Picture 24"/>
+            <wp:docPr id="25" name="Picture 25"/>
             <wp:cNvGraphicFramePr>
               <a:graphicFrameLocks noChangeAspect="1"/>
             </wp:cNvGraphicFramePr>
@@ -4899,7 +4951,7 @@
                     <pic:cNvPicPr/>
                   </pic:nvPicPr>
                   <pic:blipFill>
-                    <a:blip r:embed="rId32"/>
+                    <a:blip r:embed="rId33"/>
                     <a:stretch>
                       <a:fillRect/>
                     </a:stretch>
@@ -4939,7 +4991,7 @@
         <w:drawing>
           <wp:inline xmlns:a="http://schemas.openxmlformats.org/drawingml/2006/main" xmlns:pic="http://schemas.openxmlformats.org/drawingml/2006/picture">
             <wp:extent cx="5212080" cy="2716362"/>
-            <wp:docPr id="25" name="Picture 25"/>
+            <wp:docPr id="26" name="Picture 26"/>
             <wp:cNvGraphicFramePr>
               <a:graphicFrameLocks noChangeAspect="1"/>
             </wp:cNvGraphicFramePr>
@@ -4951,7 +5003,7 @@
                     <pic:cNvPicPr/>
                   </pic:nvPicPr>
                   <pic:blipFill>
-                    <a:blip r:embed="rId33"/>
+                    <a:blip r:embed="rId34"/>
                     <a:stretch>
                       <a:fillRect/>
                     </a:stretch>
@@ -4991,7 +5043,7 @@
         <w:drawing>
           <wp:inline xmlns:a="http://schemas.openxmlformats.org/drawingml/2006/main" xmlns:pic="http://schemas.openxmlformats.org/drawingml/2006/picture">
             <wp:extent cx="5212080" cy="2716362"/>
-            <wp:docPr id="26" name="Picture 26"/>
+            <wp:docPr id="27" name="Picture 27"/>
             <wp:cNvGraphicFramePr>
               <a:graphicFrameLocks noChangeAspect="1"/>
             </wp:cNvGraphicFramePr>
@@ -5003,7 +5055,7 @@
                     <pic:cNvPicPr/>
                   </pic:nvPicPr>
                   <pic:blipFill>
-                    <a:blip r:embed="rId34"/>
+                    <a:blip r:embed="rId35"/>
                     <a:stretch>
                       <a:fillRect/>
                     </a:stretch>
@@ -5043,7 +5095,7 @@
         <w:drawing>
           <wp:inline xmlns:a="http://schemas.openxmlformats.org/drawingml/2006/main" xmlns:pic="http://schemas.openxmlformats.org/drawingml/2006/picture">
             <wp:extent cx="5212080" cy="2716362"/>
-            <wp:docPr id="27" name="Picture 27"/>
+            <wp:docPr id="28" name="Picture 28"/>
             <wp:cNvGraphicFramePr>
               <a:graphicFrameLocks noChangeAspect="1"/>
             </wp:cNvGraphicFramePr>
@@ -5055,7 +5107,7 @@
                     <pic:cNvPicPr/>
                   </pic:nvPicPr>
                   <pic:blipFill>
-                    <a:blip r:embed="rId35"/>
+                    <a:blip r:embed="rId36"/>
                     <a:stretch>
                       <a:fillRect/>
                     </a:stretch>
@@ -5095,7 +5147,7 @@
         <w:drawing>
           <wp:inline xmlns:a="http://schemas.openxmlformats.org/drawingml/2006/main" xmlns:pic="http://schemas.openxmlformats.org/drawingml/2006/picture">
             <wp:extent cx="5212080" cy="2716362"/>
-            <wp:docPr id="28" name="Picture 28"/>
+            <wp:docPr id="29" name="Picture 29"/>
             <wp:cNvGraphicFramePr>
               <a:graphicFrameLocks noChangeAspect="1"/>
             </wp:cNvGraphicFramePr>
@@ -5107,7 +5159,7 @@
                     <pic:cNvPicPr/>
                   </pic:nvPicPr>
                   <pic:blipFill>
-                    <a:blip r:embed="rId36"/>
+                    <a:blip r:embed="rId37"/>
                     <a:stretch>
                       <a:fillRect/>
                     </a:stretch>
@@ -5155,7 +5207,7 @@
         <w:drawing>
           <wp:inline xmlns:a="http://schemas.openxmlformats.org/drawingml/2006/main" xmlns:pic="http://schemas.openxmlformats.org/drawingml/2006/picture">
             <wp:extent cx="5212080" cy="2860766"/>
-            <wp:docPr id="29" name="Picture 29"/>
+            <wp:docPr id="30" name="Picture 30"/>
             <wp:cNvGraphicFramePr>
               <a:graphicFrameLocks noChangeAspect="1"/>
             </wp:cNvGraphicFramePr>
@@ -5167,7 +5219,7 @@
                     <pic:cNvPicPr/>
                   </pic:nvPicPr>
                   <pic:blipFill>
-                    <a:blip r:embed="rId37"/>
+                    <a:blip r:embed="rId38"/>
                     <a:stretch>
                       <a:fillRect/>
                     </a:stretch>
@@ -5207,7 +5259,7 @@
         <w:drawing>
           <wp:inline xmlns:a="http://schemas.openxmlformats.org/drawingml/2006/main" xmlns:pic="http://schemas.openxmlformats.org/drawingml/2006/picture">
             <wp:extent cx="5212080" cy="2860766"/>
-            <wp:docPr id="30" name="Picture 30"/>
+            <wp:docPr id="31" name="Picture 31"/>
             <wp:cNvGraphicFramePr>
               <a:graphicFrameLocks noChangeAspect="1"/>
             </wp:cNvGraphicFramePr>
@@ -5219,7 +5271,7 @@
                     <pic:cNvPicPr/>
                   </pic:nvPicPr>
                   <pic:blipFill>
-                    <a:blip r:embed="rId38"/>
+                    <a:blip r:embed="rId39"/>
                     <a:stretch>
                       <a:fillRect/>
                     </a:stretch>
@@ -5259,7 +5311,7 @@
         <w:drawing>
           <wp:inline xmlns:a="http://schemas.openxmlformats.org/drawingml/2006/main" xmlns:pic="http://schemas.openxmlformats.org/drawingml/2006/picture">
             <wp:extent cx="5212080" cy="2860766"/>
-            <wp:docPr id="31" name="Picture 31"/>
+            <wp:docPr id="32" name="Picture 32"/>
             <wp:cNvGraphicFramePr>
               <a:graphicFrameLocks noChangeAspect="1"/>
             </wp:cNvGraphicFramePr>
@@ -5271,7 +5323,7 @@
                     <pic:cNvPicPr/>
                   </pic:nvPicPr>
                   <pic:blipFill>
-                    <a:blip r:embed="rId39"/>
+                    <a:blip r:embed="rId40"/>
                     <a:stretch>
                       <a:fillRect/>
                     </a:stretch>
@@ -5311,7 +5363,7 @@
         <w:drawing>
           <wp:inline xmlns:a="http://schemas.openxmlformats.org/drawingml/2006/main" xmlns:pic="http://schemas.openxmlformats.org/drawingml/2006/picture">
             <wp:extent cx="5212080" cy="2860766"/>
-            <wp:docPr id="32" name="Picture 32"/>
+            <wp:docPr id="33" name="Picture 33"/>
             <wp:cNvGraphicFramePr>
               <a:graphicFrameLocks noChangeAspect="1"/>
             </wp:cNvGraphicFramePr>
@@ -5323,7 +5375,7 @@
                     <pic:cNvPicPr/>
                   </pic:nvPicPr>
                   <pic:blipFill>
-                    <a:blip r:embed="rId40"/>
+                    <a:blip r:embed="rId41"/>
                     <a:stretch>
                       <a:fillRect/>
                     </a:stretch>

</xml_diff>

<commit_message>
fix(report): add the missing pipeline diagram to the three newer cases (#231)
The tmp-smx, tetrazoles, and pyrazolylnucleosides report bundles never received
a copy of the pipeline diagram (fig0), so their Overview section rendered
"[figure not found: fig0_pipeline.png]". The diagram is case-agnostic — the
three existing copies are byte-identical — so copy the shared image into each
missing case's report/figures/pipeline/ and re-render the three reports; the
Overview now embeds the diagram.

Co-authored-by: Claude Opus 4.8 <noreply@anthropic.com>
</commit_message>
<xml_diff>
--- a/cases/tetrazoles/report/report.docx
+++ b/cases/tetrazoles/report/report.docx
@@ -16,7 +16,7 @@
           <w:b w:val="0"/>
           <w:color w:val="718096"/>
         </w:rPr>
-        <w:t>Substrate: Cu(111)  |  Medium: 1 M HNO3  |  DFT level: B3LYP/6-311++G(d,p) (ddCOSMO:water)  |  Generated 2026-07-14 18:07</w:t>
+        <w:t>Substrate: Cu(111)  |  Medium: 1 M HNO3  |  DFT level: B3LYP/6-311++G(d,p) (ddCOSMO:water)  |  Generated 2026-07-14 18:15</w:t>
       </w:r>
     </w:p>
     <w:p>
@@ -37,6 +37,58 @@
       </w:pPr>
       <w:r>
         <w:t>1. Overview</w:t>
+      </w:r>
+    </w:p>
+    <w:p>
+      <w:pPr>
+        <w:jc w:val="center"/>
+      </w:pPr>
+      <w:r>
+        <w:drawing>
+          <wp:inline xmlns:a="http://schemas.openxmlformats.org/drawingml/2006/main" xmlns:pic="http://schemas.openxmlformats.org/drawingml/2006/picture">
+            <wp:extent cx="5212080" cy="5122037"/>
+            <wp:docPr id="1" name="Picture 1"/>
+            <wp:cNvGraphicFramePr>
+              <a:graphicFrameLocks noChangeAspect="1"/>
+            </wp:cNvGraphicFramePr>
+            <a:graphic>
+              <a:graphicData uri="http://schemas.openxmlformats.org/drawingml/2006/picture">
+                <pic:pic>
+                  <pic:nvPicPr>
+                    <pic:cNvPr id="0" name="fig0_pipeline.png"/>
+                    <pic:cNvPicPr/>
+                  </pic:nvPicPr>
+                  <pic:blipFill>
+                    <a:blip r:embed="rId9"/>
+                    <a:stretch>
+                      <a:fillRect/>
+                    </a:stretch>
+                  </pic:blipFill>
+                  <pic:spPr>
+                    <a:xfrm>
+                      <a:off x="0" y="0"/>
+                      <a:ext cx="5212080" cy="5122037"/>
+                    </a:xfrm>
+                    <a:prstGeom prst="rect"/>
+                  </pic:spPr>
+                </pic:pic>
+              </a:graphicData>
+            </a:graphic>
+          </wp:inline>
+        </w:drawing>
+      </w:r>
+    </w:p>
+    <w:p>
+      <w:pPr>
+        <w:jc w:val="center"/>
+      </w:pPr>
+      <w:r>
+        <w:rPr>
+          <w:i/>
+          <w:color w:val="718096"/>
+          <w:sz w:val="16"/>
+        </w:rPr>
+        <w:t>corrosim pipeline</w:t>
       </w:r>
     </w:p>
     <w:p>
@@ -837,7 +889,7 @@
         <w:drawing>
           <wp:inline xmlns:a="http://schemas.openxmlformats.org/drawingml/2006/main" xmlns:pic="http://schemas.openxmlformats.org/drawingml/2006/picture">
             <wp:extent cx="5212080" cy="2842953"/>
-            <wp:docPr id="1" name="Picture 1"/>
+            <wp:docPr id="2" name="Picture 2"/>
             <wp:cNvGraphicFramePr>
               <a:graphicFrameLocks noChangeAspect="1"/>
             </wp:cNvGraphicFramePr>
@@ -849,7 +901,7 @@
                     <pic:cNvPicPr/>
                   </pic:nvPicPr>
                   <pic:blipFill>
-                    <a:blip r:embed="rId9"/>
+                    <a:blip r:embed="rId10"/>
                     <a:stretch>
                       <a:fillRect/>
                     </a:stretch>
@@ -889,7 +941,7 @@
         <w:drawing>
           <wp:inline xmlns:a="http://schemas.openxmlformats.org/drawingml/2006/main" xmlns:pic="http://schemas.openxmlformats.org/drawingml/2006/picture">
             <wp:extent cx="5212080" cy="3235815"/>
-            <wp:docPr id="2" name="Picture 2"/>
+            <wp:docPr id="3" name="Picture 3"/>
             <wp:cNvGraphicFramePr>
               <a:graphicFrameLocks noChangeAspect="1"/>
             </wp:cNvGraphicFramePr>
@@ -901,7 +953,7 @@
                     <pic:cNvPicPr/>
                   </pic:nvPicPr>
                   <pic:blipFill>
-                    <a:blip r:embed="rId10"/>
+                    <a:blip r:embed="rId11"/>
                     <a:stretch>
                       <a:fillRect/>
                     </a:stretch>
@@ -949,7 +1001,7 @@
         <w:drawing>
           <wp:inline xmlns:a="http://schemas.openxmlformats.org/drawingml/2006/main" xmlns:pic="http://schemas.openxmlformats.org/drawingml/2006/picture">
             <wp:extent cx="2651760" cy="2810505"/>
-            <wp:docPr id="3" name="Picture 3"/>
+            <wp:docPr id="4" name="Picture 4"/>
             <wp:cNvGraphicFramePr>
               <a:graphicFrameLocks noChangeAspect="1"/>
             </wp:cNvGraphicFramePr>
@@ -961,7 +1013,7 @@
                     <pic:cNvPicPr/>
                   </pic:nvPicPr>
                   <pic:blipFill>
-                    <a:blip r:embed="rId11"/>
+                    <a:blip r:embed="rId12"/>
                     <a:stretch>
                       <a:fillRect/>
                     </a:stretch>
@@ -1001,7 +1053,7 @@
         <w:drawing>
           <wp:inline xmlns:a="http://schemas.openxmlformats.org/drawingml/2006/main" xmlns:pic="http://schemas.openxmlformats.org/drawingml/2006/picture">
             <wp:extent cx="2651760" cy="2810505"/>
-            <wp:docPr id="4" name="Picture 4"/>
+            <wp:docPr id="5" name="Picture 5"/>
             <wp:cNvGraphicFramePr>
               <a:graphicFrameLocks noChangeAspect="1"/>
             </wp:cNvGraphicFramePr>
@@ -1013,7 +1065,7 @@
                     <pic:cNvPicPr/>
                   </pic:nvPicPr>
                   <pic:blipFill>
-                    <a:blip r:embed="rId12"/>
+                    <a:blip r:embed="rId13"/>
                     <a:stretch>
                       <a:fillRect/>
                     </a:stretch>
@@ -1053,7 +1105,7 @@
         <w:drawing>
           <wp:inline xmlns:a="http://schemas.openxmlformats.org/drawingml/2006/main" xmlns:pic="http://schemas.openxmlformats.org/drawingml/2006/picture">
             <wp:extent cx="2651760" cy="2810505"/>
-            <wp:docPr id="5" name="Picture 5"/>
+            <wp:docPr id="6" name="Picture 6"/>
             <wp:cNvGraphicFramePr>
               <a:graphicFrameLocks noChangeAspect="1"/>
             </wp:cNvGraphicFramePr>
@@ -1065,7 +1117,7 @@
                     <pic:cNvPicPr/>
                   </pic:nvPicPr>
                   <pic:blipFill>
-                    <a:blip r:embed="rId13"/>
+                    <a:blip r:embed="rId14"/>
                     <a:stretch>
                       <a:fillRect/>
                     </a:stretch>
@@ -1105,7 +1157,7 @@
         <w:drawing>
           <wp:inline xmlns:a="http://schemas.openxmlformats.org/drawingml/2006/main" xmlns:pic="http://schemas.openxmlformats.org/drawingml/2006/picture">
             <wp:extent cx="2651760" cy="2810505"/>
-            <wp:docPr id="6" name="Picture 6"/>
+            <wp:docPr id="7" name="Picture 7"/>
             <wp:cNvGraphicFramePr>
               <a:graphicFrameLocks noChangeAspect="1"/>
             </wp:cNvGraphicFramePr>
@@ -1117,7 +1169,7 @@
                     <pic:cNvPicPr/>
                   </pic:nvPicPr>
                   <pic:blipFill>
-                    <a:blip r:embed="rId14"/>
+                    <a:blip r:embed="rId15"/>
                     <a:stretch>
                       <a:fillRect/>
                     </a:stretch>
@@ -1157,7 +1209,7 @@
         <w:drawing>
           <wp:inline xmlns:a="http://schemas.openxmlformats.org/drawingml/2006/main" xmlns:pic="http://schemas.openxmlformats.org/drawingml/2006/picture">
             <wp:extent cx="2651760" cy="2810505"/>
-            <wp:docPr id="7" name="Picture 7"/>
+            <wp:docPr id="8" name="Picture 8"/>
             <wp:cNvGraphicFramePr>
               <a:graphicFrameLocks noChangeAspect="1"/>
             </wp:cNvGraphicFramePr>
@@ -1169,7 +1221,7 @@
                     <pic:cNvPicPr/>
                   </pic:nvPicPr>
                   <pic:blipFill>
-                    <a:blip r:embed="rId15"/>
+                    <a:blip r:embed="rId16"/>
                     <a:stretch>
                       <a:fillRect/>
                     </a:stretch>
@@ -1209,7 +1261,7 @@
         <w:drawing>
           <wp:inline xmlns:a="http://schemas.openxmlformats.org/drawingml/2006/main" xmlns:pic="http://schemas.openxmlformats.org/drawingml/2006/picture">
             <wp:extent cx="2651760" cy="2810505"/>
-            <wp:docPr id="8" name="Picture 8"/>
+            <wp:docPr id="9" name="Picture 9"/>
             <wp:cNvGraphicFramePr>
               <a:graphicFrameLocks noChangeAspect="1"/>
             </wp:cNvGraphicFramePr>
@@ -1221,7 +1273,7 @@
                     <pic:cNvPicPr/>
                   </pic:nvPicPr>
                   <pic:blipFill>
-                    <a:blip r:embed="rId16"/>
+                    <a:blip r:embed="rId17"/>
                     <a:stretch>
                       <a:fillRect/>
                     </a:stretch>
@@ -1261,7 +1313,7 @@
         <w:drawing>
           <wp:inline xmlns:a="http://schemas.openxmlformats.org/drawingml/2006/main" xmlns:pic="http://schemas.openxmlformats.org/drawingml/2006/picture">
             <wp:extent cx="2651760" cy="2810505"/>
-            <wp:docPr id="9" name="Picture 9"/>
+            <wp:docPr id="10" name="Picture 10"/>
             <wp:cNvGraphicFramePr>
               <a:graphicFrameLocks noChangeAspect="1"/>
             </wp:cNvGraphicFramePr>
@@ -1273,7 +1325,7 @@
                     <pic:cNvPicPr/>
                   </pic:nvPicPr>
                   <pic:blipFill>
-                    <a:blip r:embed="rId17"/>
+                    <a:blip r:embed="rId18"/>
                     <a:stretch>
                       <a:fillRect/>
                     </a:stretch>
@@ -1313,7 +1365,7 @@
         <w:drawing>
           <wp:inline xmlns:a="http://schemas.openxmlformats.org/drawingml/2006/main" xmlns:pic="http://schemas.openxmlformats.org/drawingml/2006/picture">
             <wp:extent cx="2651760" cy="2810505"/>
-            <wp:docPr id="10" name="Picture 10"/>
+            <wp:docPr id="11" name="Picture 11"/>
             <wp:cNvGraphicFramePr>
               <a:graphicFrameLocks noChangeAspect="1"/>
             </wp:cNvGraphicFramePr>
@@ -1325,7 +1377,7 @@
                     <pic:cNvPicPr/>
                   </pic:nvPicPr>
                   <pic:blipFill>
-                    <a:blip r:embed="rId18"/>
+                    <a:blip r:embed="rId19"/>
                     <a:stretch>
                       <a:fillRect/>
                     </a:stretch>
@@ -1365,7 +1417,7 @@
         <w:drawing>
           <wp:inline xmlns:a="http://schemas.openxmlformats.org/drawingml/2006/main" xmlns:pic="http://schemas.openxmlformats.org/drawingml/2006/picture">
             <wp:extent cx="5212080" cy="1456481"/>
-            <wp:docPr id="11" name="Picture 11"/>
+            <wp:docPr id="12" name="Picture 12"/>
             <wp:cNvGraphicFramePr>
               <a:graphicFrameLocks noChangeAspect="1"/>
             </wp:cNvGraphicFramePr>
@@ -1377,7 +1429,7 @@
                     <pic:cNvPicPr/>
                   </pic:nvPicPr>
                   <pic:blipFill>
-                    <a:blip r:embed="rId19"/>
+                    <a:blip r:embed="rId20"/>
                     <a:stretch>
                       <a:fillRect/>
                     </a:stretch>
@@ -1417,7 +1469,7 @@
         <w:drawing>
           <wp:inline xmlns:a="http://schemas.openxmlformats.org/drawingml/2006/main" xmlns:pic="http://schemas.openxmlformats.org/drawingml/2006/picture">
             <wp:extent cx="5212080" cy="2100390"/>
-            <wp:docPr id="12" name="Picture 12"/>
+            <wp:docPr id="13" name="Picture 13"/>
             <wp:cNvGraphicFramePr>
               <a:graphicFrameLocks noChangeAspect="1"/>
             </wp:cNvGraphicFramePr>
@@ -1429,7 +1481,7 @@
                     <pic:cNvPicPr/>
                   </pic:nvPicPr>
                   <pic:blipFill>
-                    <a:blip r:embed="rId20"/>
+                    <a:blip r:embed="rId21"/>
                     <a:stretch>
                       <a:fillRect/>
                     </a:stretch>
@@ -4299,7 +4351,7 @@
         <w:drawing>
           <wp:inline xmlns:a="http://schemas.openxmlformats.org/drawingml/2006/main" xmlns:pic="http://schemas.openxmlformats.org/drawingml/2006/picture">
             <wp:extent cx="5212080" cy="2015906"/>
-            <wp:docPr id="13" name="Picture 13"/>
+            <wp:docPr id="14" name="Picture 14"/>
             <wp:cNvGraphicFramePr>
               <a:graphicFrameLocks noChangeAspect="1"/>
             </wp:cNvGraphicFramePr>
@@ -4311,7 +4363,7 @@
                     <pic:cNvPicPr/>
                   </pic:nvPicPr>
                   <pic:blipFill>
-                    <a:blip r:embed="rId21"/>
+                    <a:blip r:embed="rId22"/>
                     <a:stretch>
                       <a:fillRect/>
                     </a:stretch>
@@ -4351,7 +4403,7 @@
         <w:drawing>
           <wp:inline xmlns:a="http://schemas.openxmlformats.org/drawingml/2006/main" xmlns:pic="http://schemas.openxmlformats.org/drawingml/2006/picture">
             <wp:extent cx="5212080" cy="2015906"/>
-            <wp:docPr id="14" name="Picture 14"/>
+            <wp:docPr id="15" name="Picture 15"/>
             <wp:cNvGraphicFramePr>
               <a:graphicFrameLocks noChangeAspect="1"/>
             </wp:cNvGraphicFramePr>
@@ -4363,7 +4415,7 @@
                     <pic:cNvPicPr/>
                   </pic:nvPicPr>
                   <pic:blipFill>
-                    <a:blip r:embed="rId22"/>
+                    <a:blip r:embed="rId23"/>
                     <a:stretch>
                       <a:fillRect/>
                     </a:stretch>
@@ -4403,7 +4455,7 @@
         <w:drawing>
           <wp:inline xmlns:a="http://schemas.openxmlformats.org/drawingml/2006/main" xmlns:pic="http://schemas.openxmlformats.org/drawingml/2006/picture">
             <wp:extent cx="5212080" cy="2018957"/>
-            <wp:docPr id="15" name="Picture 15"/>
+            <wp:docPr id="16" name="Picture 16"/>
             <wp:cNvGraphicFramePr>
               <a:graphicFrameLocks noChangeAspect="1"/>
             </wp:cNvGraphicFramePr>
@@ -4415,7 +4467,7 @@
                     <pic:cNvPicPr/>
                   </pic:nvPicPr>
                   <pic:blipFill>
-                    <a:blip r:embed="rId23"/>
+                    <a:blip r:embed="rId24"/>
                     <a:stretch>
                       <a:fillRect/>
                     </a:stretch>
@@ -4455,7 +4507,7 @@
         <w:drawing>
           <wp:inline xmlns:a="http://schemas.openxmlformats.org/drawingml/2006/main" xmlns:pic="http://schemas.openxmlformats.org/drawingml/2006/picture">
             <wp:extent cx="5212080" cy="2015906"/>
-            <wp:docPr id="16" name="Picture 16"/>
+            <wp:docPr id="17" name="Picture 17"/>
             <wp:cNvGraphicFramePr>
               <a:graphicFrameLocks noChangeAspect="1"/>
             </wp:cNvGraphicFramePr>
@@ -4467,7 +4519,7 @@
                     <pic:cNvPicPr/>
                   </pic:nvPicPr>
                   <pic:blipFill>
-                    <a:blip r:embed="rId24"/>
+                    <a:blip r:embed="rId25"/>
                     <a:stretch>
                       <a:fillRect/>
                     </a:stretch>
@@ -4515,7 +4567,7 @@
         <w:drawing>
           <wp:inline xmlns:a="http://schemas.openxmlformats.org/drawingml/2006/main" xmlns:pic="http://schemas.openxmlformats.org/drawingml/2006/picture">
             <wp:extent cx="2651760" cy="2372627"/>
-            <wp:docPr id="17" name="Picture 17"/>
+            <wp:docPr id="18" name="Picture 18"/>
             <wp:cNvGraphicFramePr>
               <a:graphicFrameLocks noChangeAspect="1"/>
             </wp:cNvGraphicFramePr>
@@ -4527,7 +4579,7 @@
                     <pic:cNvPicPr/>
                   </pic:nvPicPr>
                   <pic:blipFill>
-                    <a:blip r:embed="rId25"/>
+                    <a:blip r:embed="rId26"/>
                     <a:stretch>
                       <a:fillRect/>
                     </a:stretch>
@@ -4567,7 +4619,7 @@
         <w:drawing>
           <wp:inline xmlns:a="http://schemas.openxmlformats.org/drawingml/2006/main" xmlns:pic="http://schemas.openxmlformats.org/drawingml/2006/picture">
             <wp:extent cx="2651760" cy="2372627"/>
-            <wp:docPr id="18" name="Picture 18"/>
+            <wp:docPr id="19" name="Picture 19"/>
             <wp:cNvGraphicFramePr>
               <a:graphicFrameLocks noChangeAspect="1"/>
             </wp:cNvGraphicFramePr>
@@ -4579,7 +4631,7 @@
                     <pic:cNvPicPr/>
                   </pic:nvPicPr>
                   <pic:blipFill>
-                    <a:blip r:embed="rId26"/>
+                    <a:blip r:embed="rId27"/>
                     <a:stretch>
                       <a:fillRect/>
                     </a:stretch>
@@ -4619,7 +4671,7 @@
         <w:drawing>
           <wp:inline xmlns:a="http://schemas.openxmlformats.org/drawingml/2006/main" xmlns:pic="http://schemas.openxmlformats.org/drawingml/2006/picture">
             <wp:extent cx="2651760" cy="2372627"/>
-            <wp:docPr id="19" name="Picture 19"/>
+            <wp:docPr id="20" name="Picture 20"/>
             <wp:cNvGraphicFramePr>
               <a:graphicFrameLocks noChangeAspect="1"/>
             </wp:cNvGraphicFramePr>
@@ -4631,7 +4683,7 @@
                     <pic:cNvPicPr/>
                   </pic:nvPicPr>
                   <pic:blipFill>
-                    <a:blip r:embed="rId27"/>
+                    <a:blip r:embed="rId28"/>
                     <a:stretch>
                       <a:fillRect/>
                     </a:stretch>
@@ -4671,7 +4723,7 @@
         <w:drawing>
           <wp:inline xmlns:a="http://schemas.openxmlformats.org/drawingml/2006/main" xmlns:pic="http://schemas.openxmlformats.org/drawingml/2006/picture">
             <wp:extent cx="2651760" cy="2389153"/>
-            <wp:docPr id="20" name="Picture 20"/>
+            <wp:docPr id="21" name="Picture 21"/>
             <wp:cNvGraphicFramePr>
               <a:graphicFrameLocks noChangeAspect="1"/>
             </wp:cNvGraphicFramePr>
@@ -4683,7 +4735,7 @@
                     <pic:cNvPicPr/>
                   </pic:nvPicPr>
                   <pic:blipFill>
-                    <a:blip r:embed="rId28"/>
+                    <a:blip r:embed="rId29"/>
                     <a:stretch>
                       <a:fillRect/>
                     </a:stretch>
@@ -4731,7 +4783,7 @@
         <w:drawing>
           <wp:inline xmlns:a="http://schemas.openxmlformats.org/drawingml/2006/main" xmlns:pic="http://schemas.openxmlformats.org/drawingml/2006/picture">
             <wp:extent cx="5212080" cy="3046873"/>
-            <wp:docPr id="21" name="Picture 21"/>
+            <wp:docPr id="22" name="Picture 22"/>
             <wp:cNvGraphicFramePr>
               <a:graphicFrameLocks noChangeAspect="1"/>
             </wp:cNvGraphicFramePr>
@@ -4743,7 +4795,7 @@
                     <pic:cNvPicPr/>
                   </pic:nvPicPr>
                   <pic:blipFill>
-                    <a:blip r:embed="rId29"/>
+                    <a:blip r:embed="rId30"/>
                     <a:stretch>
                       <a:fillRect/>
                     </a:stretch>
@@ -4783,7 +4835,7 @@
         <w:drawing>
           <wp:inline xmlns:a="http://schemas.openxmlformats.org/drawingml/2006/main" xmlns:pic="http://schemas.openxmlformats.org/drawingml/2006/picture">
             <wp:extent cx="5212080" cy="3046873"/>
-            <wp:docPr id="22" name="Picture 22"/>
+            <wp:docPr id="23" name="Picture 23"/>
             <wp:cNvGraphicFramePr>
               <a:graphicFrameLocks noChangeAspect="1"/>
             </wp:cNvGraphicFramePr>
@@ -4795,7 +4847,7 @@
                     <pic:cNvPicPr/>
                   </pic:nvPicPr>
                   <pic:blipFill>
-                    <a:blip r:embed="rId30"/>
+                    <a:blip r:embed="rId31"/>
                     <a:stretch>
                       <a:fillRect/>
                     </a:stretch>
@@ -4835,7 +4887,7 @@
         <w:drawing>
           <wp:inline xmlns:a="http://schemas.openxmlformats.org/drawingml/2006/main" xmlns:pic="http://schemas.openxmlformats.org/drawingml/2006/picture">
             <wp:extent cx="5212080" cy="3046873"/>
-            <wp:docPr id="23" name="Picture 23"/>
+            <wp:docPr id="24" name="Picture 24"/>
             <wp:cNvGraphicFramePr>
               <a:graphicFrameLocks noChangeAspect="1"/>
             </wp:cNvGraphicFramePr>
@@ -4847,7 +4899,7 @@
                     <pic:cNvPicPr/>
                   </pic:nvPicPr>
                   <pic:blipFill>
-                    <a:blip r:embed="rId31"/>
+                    <a:blip r:embed="rId32"/>
                     <a:stretch>
                       <a:fillRect/>
                     </a:stretch>
@@ -4887,7 +4939,7 @@
         <w:drawing>
           <wp:inline xmlns:a="http://schemas.openxmlformats.org/drawingml/2006/main" xmlns:pic="http://schemas.openxmlformats.org/drawingml/2006/picture">
             <wp:extent cx="5212080" cy="3046873"/>
-            <wp:docPr id="24" name="Picture 24"/>
+            <wp:docPr id="25" name="Picture 25"/>
             <wp:cNvGraphicFramePr>
               <a:graphicFrameLocks noChangeAspect="1"/>
             </wp:cNvGraphicFramePr>
@@ -4899,7 +4951,7 @@
                     <pic:cNvPicPr/>
                   </pic:nvPicPr>
                   <pic:blipFill>
-                    <a:blip r:embed="rId32"/>
+                    <a:blip r:embed="rId33"/>
                     <a:stretch>
                       <a:fillRect/>
                     </a:stretch>
@@ -4939,7 +4991,7 @@
         <w:drawing>
           <wp:inline xmlns:a="http://schemas.openxmlformats.org/drawingml/2006/main" xmlns:pic="http://schemas.openxmlformats.org/drawingml/2006/picture">
             <wp:extent cx="5212080" cy="2716362"/>
-            <wp:docPr id="25" name="Picture 25"/>
+            <wp:docPr id="26" name="Picture 26"/>
             <wp:cNvGraphicFramePr>
               <a:graphicFrameLocks noChangeAspect="1"/>
             </wp:cNvGraphicFramePr>
@@ -4951,7 +5003,7 @@
                     <pic:cNvPicPr/>
                   </pic:nvPicPr>
                   <pic:blipFill>
-                    <a:blip r:embed="rId33"/>
+                    <a:blip r:embed="rId34"/>
                     <a:stretch>
                       <a:fillRect/>
                     </a:stretch>
@@ -4991,7 +5043,7 @@
         <w:drawing>
           <wp:inline xmlns:a="http://schemas.openxmlformats.org/drawingml/2006/main" xmlns:pic="http://schemas.openxmlformats.org/drawingml/2006/picture">
             <wp:extent cx="5212080" cy="2716362"/>
-            <wp:docPr id="26" name="Picture 26"/>
+            <wp:docPr id="27" name="Picture 27"/>
             <wp:cNvGraphicFramePr>
               <a:graphicFrameLocks noChangeAspect="1"/>
             </wp:cNvGraphicFramePr>
@@ -5003,7 +5055,7 @@
                     <pic:cNvPicPr/>
                   </pic:nvPicPr>
                   <pic:blipFill>
-                    <a:blip r:embed="rId34"/>
+                    <a:blip r:embed="rId35"/>
                     <a:stretch>
                       <a:fillRect/>
                     </a:stretch>
@@ -5043,7 +5095,7 @@
         <w:drawing>
           <wp:inline xmlns:a="http://schemas.openxmlformats.org/drawingml/2006/main" xmlns:pic="http://schemas.openxmlformats.org/drawingml/2006/picture">
             <wp:extent cx="5212080" cy="2716362"/>
-            <wp:docPr id="27" name="Picture 27"/>
+            <wp:docPr id="28" name="Picture 28"/>
             <wp:cNvGraphicFramePr>
               <a:graphicFrameLocks noChangeAspect="1"/>
             </wp:cNvGraphicFramePr>
@@ -5055,7 +5107,7 @@
                     <pic:cNvPicPr/>
                   </pic:nvPicPr>
                   <pic:blipFill>
-                    <a:blip r:embed="rId35"/>
+                    <a:blip r:embed="rId36"/>
                     <a:stretch>
                       <a:fillRect/>
                     </a:stretch>
@@ -5095,7 +5147,7 @@
         <w:drawing>
           <wp:inline xmlns:a="http://schemas.openxmlformats.org/drawingml/2006/main" xmlns:pic="http://schemas.openxmlformats.org/drawingml/2006/picture">
             <wp:extent cx="5212080" cy="2716362"/>
-            <wp:docPr id="28" name="Picture 28"/>
+            <wp:docPr id="29" name="Picture 29"/>
             <wp:cNvGraphicFramePr>
               <a:graphicFrameLocks noChangeAspect="1"/>
             </wp:cNvGraphicFramePr>
@@ -5107,7 +5159,7 @@
                     <pic:cNvPicPr/>
                   </pic:nvPicPr>
                   <pic:blipFill>
-                    <a:blip r:embed="rId36"/>
+                    <a:blip r:embed="rId37"/>
                     <a:stretch>
                       <a:fillRect/>
                     </a:stretch>
@@ -5155,7 +5207,7 @@
         <w:drawing>
           <wp:inline xmlns:a="http://schemas.openxmlformats.org/drawingml/2006/main" xmlns:pic="http://schemas.openxmlformats.org/drawingml/2006/picture">
             <wp:extent cx="5212080" cy="2860766"/>
-            <wp:docPr id="29" name="Picture 29"/>
+            <wp:docPr id="30" name="Picture 30"/>
             <wp:cNvGraphicFramePr>
               <a:graphicFrameLocks noChangeAspect="1"/>
             </wp:cNvGraphicFramePr>
@@ -5167,7 +5219,7 @@
                     <pic:cNvPicPr/>
                   </pic:nvPicPr>
                   <pic:blipFill>
-                    <a:blip r:embed="rId37"/>
+                    <a:blip r:embed="rId38"/>
                     <a:stretch>
                       <a:fillRect/>
                     </a:stretch>
@@ -5207,7 +5259,7 @@
         <w:drawing>
           <wp:inline xmlns:a="http://schemas.openxmlformats.org/drawingml/2006/main" xmlns:pic="http://schemas.openxmlformats.org/drawingml/2006/picture">
             <wp:extent cx="5212080" cy="2860766"/>
-            <wp:docPr id="30" name="Picture 30"/>
+            <wp:docPr id="31" name="Picture 31"/>
             <wp:cNvGraphicFramePr>
               <a:graphicFrameLocks noChangeAspect="1"/>
             </wp:cNvGraphicFramePr>
@@ -5219,7 +5271,7 @@
                     <pic:cNvPicPr/>
                   </pic:nvPicPr>
                   <pic:blipFill>
-                    <a:blip r:embed="rId38"/>
+                    <a:blip r:embed="rId39"/>
                     <a:stretch>
                       <a:fillRect/>
                     </a:stretch>
@@ -5259,7 +5311,7 @@
         <w:drawing>
           <wp:inline xmlns:a="http://schemas.openxmlformats.org/drawingml/2006/main" xmlns:pic="http://schemas.openxmlformats.org/drawingml/2006/picture">
             <wp:extent cx="5212080" cy="2860766"/>
-            <wp:docPr id="31" name="Picture 31"/>
+            <wp:docPr id="32" name="Picture 32"/>
             <wp:cNvGraphicFramePr>
               <a:graphicFrameLocks noChangeAspect="1"/>
             </wp:cNvGraphicFramePr>
@@ -5271,7 +5323,7 @@
                     <pic:cNvPicPr/>
                   </pic:nvPicPr>
                   <pic:blipFill>
-                    <a:blip r:embed="rId39"/>
+                    <a:blip r:embed="rId40"/>
                     <a:stretch>
                       <a:fillRect/>
                     </a:stretch>
@@ -5311,7 +5363,7 @@
         <w:drawing>
           <wp:inline xmlns:a="http://schemas.openxmlformats.org/drawingml/2006/main" xmlns:pic="http://schemas.openxmlformats.org/drawingml/2006/picture">
             <wp:extent cx="5212080" cy="2860766"/>
-            <wp:docPr id="32" name="Picture 32"/>
+            <wp:docPr id="33" name="Picture 33"/>
             <wp:cNvGraphicFramePr>
               <a:graphicFrameLocks noChangeAspect="1"/>
             </wp:cNvGraphicFramePr>
@@ -5323,7 +5375,7 @@
                     <pic:cNvPicPr/>
                   </pic:nvPicPr>
                   <pic:blipFill>
-                    <a:blip r:embed="rId40"/>
+                    <a:blip r:embed="rId41"/>
                     <a:stretch>
                       <a:fillRect/>
                     </a:stretch>

</xml_diff>